<commit_message>
Cap nhat bao cao
</commit_message>
<xml_diff>
--- a/assets/ĐẠI HỌC TRÀ VINH.docx
+++ b/assets/ĐẠI HỌC TRÀ VINH.docx
@@ -6517,104 +6517,8 @@
         <w:t>Xây dựng diễn đàn hoặc cộng đồng trao đổi kiến thức lịch sử, giúp tăng sự tương tác giữa độc giả và website.</w:t>
       </w:r>
     </w:p>
-    <w:p/>
-    <w:p>
-      <w:pPr>
-        <w:pStyle w:val="noidung"/>
-      </w:pPr>
-    </w:p>
-    <w:p>
-      <w:pPr>
-        <w:pStyle w:val="noidung"/>
-      </w:pPr>
-    </w:p>
-    <w:p>
-      <w:pPr>
-        <w:rPr>
-          <w:b/>
-          <w:caps/>
-          <w:sz w:val="30"/>
-        </w:rPr>
-      </w:pPr>
-      <w:r>
-        <w:br w:type="page"/>
-      </w:r>
-    </w:p>
-    <w:p>
-      <w:pPr>
-        <w:pStyle w:val="DEMUC"/>
-      </w:pPr>
-      <w:r>
-        <w:lastRenderedPageBreak/>
-        <w:t>Danh mục tài liệu tham khảo</w:t>
-      </w:r>
-    </w:p>
-    <w:p>
-      <w:pPr>
-        <w:pStyle w:val="noidung"/>
-      </w:pPr>
-      <w:r>
-        <w:t>Vào Zotero &gt; chọn lệnh tại khung màu đỏ:</w:t>
-      </w:r>
-    </w:p>
-    <w:p>
-      <w:pPr>
-        <w:pStyle w:val="noidung"/>
-      </w:pPr>
-      <w:r>
-        <w:rPr>
-          <w:noProof/>
-        </w:rPr>
-        <w:drawing>
-          <wp:inline distT="0" distB="0" distL="0" distR="0" wp14:anchorId="00023B0F" wp14:editId="70A05B54">
-            <wp:extent cx="5133975" cy="983213"/>
-            <wp:effectExtent l="0" t="0" r="0" b="7620"/>
-            <wp:docPr id="11" name="Picture 11"/>
-            <wp:cNvGraphicFramePr>
-              <a:graphicFrameLocks xmlns:a="http://schemas.openxmlformats.org/drawingml/2006/main" noChangeAspect="1"/>
-            </wp:cNvGraphicFramePr>
-            <a:graphic xmlns:a="http://schemas.openxmlformats.org/drawingml/2006/main">
-              <a:graphicData uri="http://schemas.openxmlformats.org/drawingml/2006/picture">
-                <pic:pic xmlns:pic="http://schemas.openxmlformats.org/drawingml/2006/picture">
-                  <pic:nvPicPr>
-                    <pic:cNvPr id="1" name=""/>
-                    <pic:cNvPicPr/>
-                  </pic:nvPicPr>
-                  <pic:blipFill>
-                    <a:blip r:embed="rId15"/>
-                    <a:stretch>
-                      <a:fillRect/>
-                    </a:stretch>
-                  </pic:blipFill>
-                  <pic:spPr>
-                    <a:xfrm>
-                      <a:off x="0" y="0"/>
-                      <a:ext cx="5167286" cy="989593"/>
-                    </a:xfrm>
-                    <a:prstGeom prst="rect">
-                      <a:avLst/>
-                    </a:prstGeom>
-                  </pic:spPr>
-                </pic:pic>
-              </a:graphicData>
-            </a:graphic>
-          </wp:inline>
-        </w:drawing>
-      </w:r>
-    </w:p>
-    <w:p>
-      <w:pPr>
-        <w:pStyle w:val="noidung"/>
-      </w:pPr>
-      <w:r>
-        <w:rPr>
-          <w:highlight w:val="yellow"/>
-        </w:rPr>
-        <w:t>Hệ thống sẽ tự động xuất ra những tài liệu đã trích dẫn ở chương cơ sở lý thuyết</w:t>
-      </w:r>
-    </w:p>
     <w:sectPr>
-      <w:footerReference w:type="default" r:id="rId16"/>
+      <w:footerReference w:type="default" r:id="rId15"/>
       <w:pgSz w:w="11907" w:h="16840" w:code="9"/>
       <w:pgMar w:top="1134" w:right="1134" w:bottom="1134" w:left="1985" w:header="680" w:footer="680" w:gutter="0"/>
       <w:pgNumType w:start="1"/>

</xml_diff>

<commit_message>
cap nhat bao cao 2
</commit_message>
<xml_diff>
--- a/assets/ĐẠI HỌC TRÀ VINH.docx
+++ b/assets/ĐẠI HỌC TRÀ VINH.docx
@@ -1738,11 +1738,111 @@
           <w:szCs w:val="28"/>
         </w:rPr>
       </w:pPr>
-      <w:r>
-        <w:rPr>
-          <w:sz w:val="28"/>
-          <w:szCs w:val="28"/>
-        </w:rPr>
+    </w:p>
+    <w:p>
+      <w:pPr>
+        <w:pStyle w:val="Heading1"/>
+      </w:pPr>
+      <w:bookmarkStart w:id="5" w:name="_Toc230160102"/>
+      <w:r>
+        <w:t>Cơ sở lý thuyết</w:t>
+      </w:r>
+      <w:bookmarkEnd w:id="5"/>
+    </w:p>
+    <w:p>
+      <w:pPr>
+        <w:pStyle w:val="noidung"/>
+      </w:pPr>
+      <w:r>
+        <w:rPr>
+          <w:highlight w:val="yellow"/>
+        </w:rPr>
+        <w:t>(Trong chương này trình bày các lý thuyết liên quan về thiết kế web, ngôn ngữ HTML, CSS, Javascript, Bootstrap framework</w:t>
+      </w:r>
+      <w:r>
+        <w:rPr>
+          <w:highlight w:val="yellow"/>
+        </w:rPr>
+        <w:t xml:space="preserve"> và có trích dẫn cụ thể theo chuẩn IEEE</w:t>
+      </w:r>
+      <w:r>
+        <w:rPr>
+          <w:highlight w:val="yellow"/>
+        </w:rPr>
+        <w:t>)</w:t>
+      </w:r>
+    </w:p>
+    <w:p>
+      <w:pPr>
+        <w:pStyle w:val="Heading2"/>
+      </w:pPr>
+      <w:bookmarkStart w:id="6" w:name="_Toc230160103"/>
+      <w:r>
+        <w:t xml:space="preserve">Tiêu đề mục </w:t>
+      </w:r>
+      <w:r>
+        <w:t>2</w:t>
+      </w:r>
+      <w:r>
+        <w:t>.1</w:t>
+      </w:r>
+      <w:bookmarkEnd w:id="6"/>
+    </w:p>
+    <w:p>
+      <w:pPr>
+        <w:pStyle w:val="Heading2"/>
+      </w:pPr>
+      <w:bookmarkStart w:id="7" w:name="_Toc230160104"/>
+      <w:r>
+        <w:t xml:space="preserve">Tiêu đề mục </w:t>
+      </w:r>
+      <w:r>
+        <w:t>2.2</w:t>
+      </w:r>
+      <w:bookmarkEnd w:id="7"/>
+    </w:p>
+    <w:p>
+      <w:pPr>
+        <w:pStyle w:val="Heading3"/>
+      </w:pPr>
+      <w:bookmarkStart w:id="8" w:name="_Toc230160105"/>
+      <w:r>
+        <w:t>Tiêu đề mục 2.2.1</w:t>
+      </w:r>
+      <w:bookmarkEnd w:id="8"/>
+    </w:p>
+    <w:p>
+      <w:pPr>
+        <w:pStyle w:val="Heading3"/>
+      </w:pPr>
+      <w:bookmarkStart w:id="9" w:name="_Toc230160106"/>
+      <w:r>
+        <w:t>Tiêu đề mục 2.2.2</w:t>
+      </w:r>
+      <w:bookmarkEnd w:id="9"/>
+    </w:p>
+    <w:p>
+      <w:pPr>
+        <w:pStyle w:val="Heading4"/>
+      </w:pPr>
+      <w:bookmarkStart w:id="10" w:name="_Toc230160107"/>
+      <w:r>
+        <w:t>Tiêu đề mục 2.2.2.1</w:t>
+      </w:r>
+      <w:bookmarkEnd w:id="10"/>
+    </w:p>
+    <w:p>
+      <w:pPr>
+        <w:pStyle w:val="Heading4"/>
+      </w:pPr>
+      <w:bookmarkStart w:id="11" w:name="_Toc230160108"/>
+      <w:r>
+        <w:t>Tiêu đề mục 2.2.2.2</w:t>
+      </w:r>
+      <w:bookmarkEnd w:id="11"/>
+    </w:p>
+    <w:p>
+      <w:r>
         <w:br w:type="page"/>
       </w:r>
     </w:p>
@@ -1750,643 +1850,535 @@
       <w:pPr>
         <w:pStyle w:val="Heading1"/>
       </w:pPr>
-      <w:bookmarkStart w:id="5" w:name="_Toc230160102"/>
+      <w:bookmarkStart w:id="12" w:name="_Toc230160109"/>
+      <w:r>
+        <w:t>Phân tích thiết kế hệ thống</w:t>
+      </w:r>
+      <w:bookmarkEnd w:id="12"/>
+    </w:p>
+    <w:p>
+      <w:pPr>
+        <w:pStyle w:val="Heading2"/>
+      </w:pPr>
+      <w:bookmarkStart w:id="13" w:name="_Toc230160110"/>
+      <w:r>
+        <w:t>Mô tả vấn đề</w:t>
+      </w:r>
+      <w:bookmarkEnd w:id="13"/>
+    </w:p>
+    <w:p>
+      <w:pPr>
+        <w:pStyle w:val="isselectedend"/>
+        <w:rPr>
+          <w:sz w:val="28"/>
+          <w:szCs w:val="28"/>
+        </w:rPr>
+      </w:pPr>
+      <w:r>
+        <w:rPr>
+          <w:sz w:val="28"/>
+          <w:szCs w:val="28"/>
+        </w:rPr>
+        <w:t>Hiện nay nhu cầu tìm kiếm và mua sách lịch sử Việt Nam ngày càng tăng. Tuy nhiên, việc tiếp cận các đầu sách lịch sử còn gặp nhiều khó khăn do nguồn sách phân tán, thiếu thông tin và chưa có hệ thống chuyên biệt hỗ trợ người đọc.</w:t>
+      </w:r>
+    </w:p>
+    <w:p>
+      <w:pPr>
+        <w:pStyle w:val="NormalWeb"/>
+        <w:rPr>
+          <w:sz w:val="28"/>
+          <w:szCs w:val="28"/>
+        </w:rPr>
+      </w:pPr>
+      <w:r>
+        <w:rPr>
+          <w:sz w:val="28"/>
+          <w:szCs w:val="28"/>
+        </w:rPr>
+        <w:t>Website mua bán sách lịch sử Việt Nam được xây dựng nhằm cung cấp nền tảng trực tuyến cho phép người dùng tìm kiếm, xem thông tin chi tiết, đặt mua sách và quản lý đơn hàng một cách thuận tiện</w:t>
+      </w:r>
+      <w:r>
+        <w:rPr>
+          <w:sz w:val="28"/>
+          <w:szCs w:val="28"/>
+        </w:rPr>
+        <w:t>.</w:t>
+      </w:r>
+    </w:p>
+    <w:p>
+      <w:pPr>
+        <w:pStyle w:val="Heading2"/>
+      </w:pPr>
+      <w:bookmarkStart w:id="14" w:name="_Toc230160111"/>
       <w:r>
         <w:lastRenderedPageBreak/>
-        <w:t>Cơ sở lý thuyết</w:t>
-      </w:r>
-      <w:bookmarkEnd w:id="5"/>
-    </w:p>
-    <w:p>
-      <w:pPr>
-        <w:pStyle w:val="noidung"/>
-      </w:pPr>
-      <w:r>
-        <w:rPr>
-          <w:highlight w:val="yellow"/>
-        </w:rPr>
-        <w:t>(Trong chương này trình bày các lý thuyết liên quan về thiết kế web, ngôn ngữ HTML, CSS, Javascript, Bootstrap framework</w:t>
-      </w:r>
-      <w:r>
-        <w:rPr>
-          <w:highlight w:val="yellow"/>
-        </w:rPr>
-        <w:t xml:space="preserve"> và có trích dẫn cụ thể theo chuẩn IEEE</w:t>
-      </w:r>
-      <w:r>
-        <w:rPr>
-          <w:highlight w:val="yellow"/>
-        </w:rPr>
-        <w:t>)</w:t>
-      </w:r>
-    </w:p>
-    <w:p>
-      <w:pPr>
-        <w:pStyle w:val="Heading2"/>
-      </w:pPr>
-      <w:bookmarkStart w:id="6" w:name="_Toc230160103"/>
-      <w:r>
-        <w:t xml:space="preserve">Tiêu đề mục </w:t>
-      </w:r>
-      <w:r>
-        <w:t>2</w:t>
-      </w:r>
-      <w:r>
-        <w:t>.1</w:t>
-      </w:r>
-      <w:bookmarkEnd w:id="6"/>
-    </w:p>
-    <w:p>
-      <w:pPr>
-        <w:pStyle w:val="Heading2"/>
-      </w:pPr>
-      <w:bookmarkStart w:id="7" w:name="_Toc230160104"/>
-      <w:r>
-        <w:t xml:space="preserve">Tiêu đề mục </w:t>
-      </w:r>
-      <w:r>
-        <w:t>2.2</w:t>
-      </w:r>
-      <w:bookmarkEnd w:id="7"/>
+        <w:t>Đặc tả yêu cầu hệ thống</w:t>
+      </w:r>
+      <w:bookmarkEnd w:id="14"/>
     </w:p>
     <w:p>
       <w:pPr>
         <w:pStyle w:val="Heading3"/>
       </w:pPr>
-      <w:bookmarkStart w:id="8" w:name="_Toc230160105"/>
-      <w:r>
-        <w:t>Tiêu đề mục 2.2.1</w:t>
-      </w:r>
-      <w:bookmarkEnd w:id="8"/>
+      <w:bookmarkStart w:id="15" w:name="_Toc230160112"/>
+      <w:r>
+        <w:t>Yêu cầu chức năng</w:t>
+      </w:r>
+      <w:bookmarkEnd w:id="15"/>
+    </w:p>
+    <w:p>
+      <w:pPr>
+        <w:spacing w:after="0" w:line="240" w:lineRule="auto"/>
+        <w:rPr>
+          <w:rFonts w:eastAsia="Times New Roman" w:cs="Times New Roman"/>
+          <w:sz w:val="28"/>
+          <w:szCs w:val="28"/>
+        </w:rPr>
+      </w:pPr>
+      <w:r>
+        <w:rPr>
+          <w:rFonts w:eastAsia="Times New Roman" w:hAnsi="Symbol" w:cs="Times New Roman"/>
+          <w:sz w:val="28"/>
+          <w:szCs w:val="28"/>
+        </w:rPr>
+        <w:t></w:t>
+      </w:r>
+      <w:r>
+        <w:rPr>
+          <w:rFonts w:eastAsia="Times New Roman" w:cs="Times New Roman"/>
+          <w:sz w:val="28"/>
+          <w:szCs w:val="28"/>
+        </w:rPr>
+        <w:t xml:space="preserve">  Đăng ký tài khoản.</w:t>
+      </w:r>
+    </w:p>
+    <w:p>
+      <w:pPr>
+        <w:spacing w:after="0" w:line="240" w:lineRule="auto"/>
+        <w:rPr>
+          <w:rFonts w:eastAsia="Times New Roman" w:cs="Times New Roman"/>
+          <w:sz w:val="28"/>
+          <w:szCs w:val="28"/>
+        </w:rPr>
+      </w:pPr>
+      <w:r>
+        <w:rPr>
+          <w:rFonts w:eastAsia="Times New Roman" w:hAnsi="Symbol" w:cs="Times New Roman"/>
+          <w:sz w:val="28"/>
+          <w:szCs w:val="28"/>
+        </w:rPr>
+        <w:t></w:t>
+      </w:r>
+      <w:r>
+        <w:rPr>
+          <w:rFonts w:eastAsia="Times New Roman" w:cs="Times New Roman"/>
+          <w:sz w:val="28"/>
+          <w:szCs w:val="28"/>
+        </w:rPr>
+        <w:t xml:space="preserve">  Đăng nhập và đăng xuất.</w:t>
+      </w:r>
+    </w:p>
+    <w:p>
+      <w:pPr>
+        <w:spacing w:after="0" w:line="240" w:lineRule="auto"/>
+        <w:rPr>
+          <w:rFonts w:eastAsia="Times New Roman" w:cs="Times New Roman"/>
+          <w:sz w:val="28"/>
+          <w:szCs w:val="28"/>
+        </w:rPr>
+      </w:pPr>
+      <w:r>
+        <w:rPr>
+          <w:rFonts w:eastAsia="Times New Roman" w:hAnsi="Symbol" w:cs="Times New Roman"/>
+          <w:sz w:val="28"/>
+          <w:szCs w:val="28"/>
+        </w:rPr>
+        <w:t></w:t>
+      </w:r>
+      <w:r>
+        <w:rPr>
+          <w:rFonts w:eastAsia="Times New Roman" w:cs="Times New Roman"/>
+          <w:sz w:val="28"/>
+          <w:szCs w:val="28"/>
+        </w:rPr>
+        <w:t xml:space="preserve">  Xem danh mục sách lịch sử.</w:t>
+      </w:r>
+    </w:p>
+    <w:p>
+      <w:pPr>
+        <w:spacing w:after="0" w:line="240" w:lineRule="auto"/>
+        <w:rPr>
+          <w:rFonts w:eastAsia="Times New Roman" w:cs="Times New Roman"/>
+          <w:sz w:val="28"/>
+          <w:szCs w:val="28"/>
+        </w:rPr>
+      </w:pPr>
+      <w:r>
+        <w:rPr>
+          <w:rFonts w:eastAsia="Times New Roman" w:hAnsi="Symbol" w:cs="Times New Roman"/>
+          <w:sz w:val="28"/>
+          <w:szCs w:val="28"/>
+        </w:rPr>
+        <w:t></w:t>
+      </w:r>
+      <w:r>
+        <w:rPr>
+          <w:rFonts w:eastAsia="Times New Roman" w:cs="Times New Roman"/>
+          <w:sz w:val="28"/>
+          <w:szCs w:val="28"/>
+        </w:rPr>
+        <w:t xml:space="preserve">  Tìm kiếm sách theo tên hoặc tác giả.</w:t>
+      </w:r>
+    </w:p>
+    <w:p>
+      <w:pPr>
+        <w:spacing w:after="0" w:line="240" w:lineRule="auto"/>
+        <w:rPr>
+          <w:rFonts w:eastAsia="Times New Roman" w:cs="Times New Roman"/>
+          <w:sz w:val="28"/>
+          <w:szCs w:val="28"/>
+        </w:rPr>
+      </w:pPr>
+      <w:r>
+        <w:rPr>
+          <w:rFonts w:eastAsia="Times New Roman" w:hAnsi="Symbol" w:cs="Times New Roman"/>
+          <w:sz w:val="28"/>
+          <w:szCs w:val="28"/>
+        </w:rPr>
+        <w:t></w:t>
+      </w:r>
+      <w:r>
+        <w:rPr>
+          <w:rFonts w:eastAsia="Times New Roman" w:cs="Times New Roman"/>
+          <w:sz w:val="28"/>
+          <w:szCs w:val="28"/>
+        </w:rPr>
+        <w:t xml:space="preserve">  Xem thông tin chi tiết sách.</w:t>
+      </w:r>
+    </w:p>
+    <w:p>
+      <w:pPr>
+        <w:spacing w:after="0" w:line="240" w:lineRule="auto"/>
+        <w:rPr>
+          <w:rFonts w:eastAsia="Times New Roman" w:cs="Times New Roman"/>
+          <w:sz w:val="28"/>
+          <w:szCs w:val="28"/>
+        </w:rPr>
+      </w:pPr>
+      <w:r>
+        <w:rPr>
+          <w:rFonts w:eastAsia="Times New Roman" w:hAnsi="Symbol" w:cs="Times New Roman"/>
+          <w:sz w:val="28"/>
+          <w:szCs w:val="28"/>
+        </w:rPr>
+        <w:t></w:t>
+      </w:r>
+      <w:r>
+        <w:rPr>
+          <w:rFonts w:eastAsia="Times New Roman" w:cs="Times New Roman"/>
+          <w:sz w:val="28"/>
+          <w:szCs w:val="28"/>
+        </w:rPr>
+        <w:t xml:space="preserve">  Thêm sách vào giỏ hàng.</w:t>
+      </w:r>
+    </w:p>
+    <w:p>
+      <w:pPr>
+        <w:spacing w:after="0" w:line="240" w:lineRule="auto"/>
+        <w:rPr>
+          <w:rFonts w:eastAsia="Times New Roman" w:cs="Times New Roman"/>
+          <w:sz w:val="28"/>
+          <w:szCs w:val="28"/>
+        </w:rPr>
+      </w:pPr>
+      <w:r>
+        <w:rPr>
+          <w:rFonts w:eastAsia="Times New Roman" w:hAnsi="Symbol" w:cs="Times New Roman"/>
+          <w:sz w:val="28"/>
+          <w:szCs w:val="28"/>
+        </w:rPr>
+        <w:t></w:t>
+      </w:r>
+      <w:r>
+        <w:rPr>
+          <w:rFonts w:eastAsia="Times New Roman" w:cs="Times New Roman"/>
+          <w:sz w:val="28"/>
+          <w:szCs w:val="28"/>
+        </w:rPr>
+        <w:t xml:space="preserve">  Đặt hàng trực tuyến.</w:t>
+      </w:r>
+    </w:p>
+    <w:p>
+      <w:pPr>
+        <w:spacing w:after="0" w:line="240" w:lineRule="auto"/>
+        <w:rPr>
+          <w:rFonts w:eastAsia="Times New Roman" w:cs="Times New Roman"/>
+          <w:sz w:val="28"/>
+          <w:szCs w:val="28"/>
+        </w:rPr>
+      </w:pPr>
+      <w:r>
+        <w:rPr>
+          <w:rFonts w:eastAsia="Times New Roman" w:hAnsi="Symbol" w:cs="Times New Roman"/>
+          <w:sz w:val="28"/>
+          <w:szCs w:val="28"/>
+        </w:rPr>
+        <w:t></w:t>
+      </w:r>
+      <w:r>
+        <w:rPr>
+          <w:rFonts w:eastAsia="Times New Roman" w:cs="Times New Roman"/>
+          <w:sz w:val="28"/>
+          <w:szCs w:val="28"/>
+        </w:rPr>
+        <w:t xml:space="preserve">  Quản lý đơn hàng.</w:t>
+      </w:r>
+    </w:p>
+    <w:p>
+      <w:pPr>
+        <w:spacing w:after="0" w:line="240" w:lineRule="auto"/>
+        <w:rPr>
+          <w:rFonts w:eastAsia="Times New Roman" w:cs="Times New Roman"/>
+          <w:sz w:val="28"/>
+          <w:szCs w:val="28"/>
+        </w:rPr>
+      </w:pPr>
+      <w:r>
+        <w:rPr>
+          <w:rFonts w:eastAsia="Times New Roman" w:hAnsi="Symbol" w:cs="Times New Roman"/>
+          <w:sz w:val="28"/>
+          <w:szCs w:val="28"/>
+        </w:rPr>
+        <w:t></w:t>
+      </w:r>
+      <w:r>
+        <w:rPr>
+          <w:rFonts w:eastAsia="Times New Roman" w:cs="Times New Roman"/>
+          <w:sz w:val="28"/>
+          <w:szCs w:val="28"/>
+        </w:rPr>
+        <w:t xml:space="preserve">  Quản lý thông tin cá nhân.</w:t>
+      </w:r>
+    </w:p>
+    <w:p>
+      <w:pPr>
+        <w:rPr>
+          <w:sz w:val="28"/>
+          <w:szCs w:val="28"/>
+        </w:rPr>
+      </w:pPr>
+      <w:r>
+        <w:rPr>
+          <w:rFonts w:eastAsia="Times New Roman" w:hAnsi="Symbol" w:cs="Times New Roman"/>
+          <w:sz w:val="28"/>
+          <w:szCs w:val="28"/>
+        </w:rPr>
+        <w:t></w:t>
+      </w:r>
+      <w:r>
+        <w:rPr>
+          <w:rFonts w:eastAsia="Times New Roman" w:cs="Times New Roman"/>
+          <w:sz w:val="28"/>
+          <w:szCs w:val="28"/>
+        </w:rPr>
+        <w:t xml:space="preserve">  Quản trị sách và người dùng.</w:t>
+      </w:r>
     </w:p>
     <w:p>
       <w:pPr>
         <w:pStyle w:val="Heading3"/>
       </w:pPr>
-      <w:bookmarkStart w:id="9" w:name="_Toc230160106"/>
-      <w:r>
-        <w:t>Tiêu đề mục 2.2.2</w:t>
-      </w:r>
-      <w:bookmarkEnd w:id="9"/>
+      <w:bookmarkStart w:id="16" w:name="_Toc230160113"/>
+      <w:r>
+        <w:t>Yêu cầu phi chức năng</w:t>
+      </w:r>
+      <w:bookmarkEnd w:id="16"/>
+    </w:p>
+    <w:p>
+      <w:pPr>
+        <w:spacing w:after="0" w:line="240" w:lineRule="auto"/>
+        <w:rPr>
+          <w:rFonts w:eastAsia="Times New Roman" w:cs="Times New Roman"/>
+          <w:sz w:val="28"/>
+          <w:szCs w:val="28"/>
+        </w:rPr>
+      </w:pPr>
+      <w:r>
+        <w:rPr>
+          <w:rFonts w:eastAsia="Times New Roman" w:hAnsi="Symbol" w:cs="Times New Roman"/>
+          <w:sz w:val="28"/>
+          <w:szCs w:val="28"/>
+        </w:rPr>
+        <w:t></w:t>
+      </w:r>
+      <w:r>
+        <w:rPr>
+          <w:rFonts w:eastAsia="Times New Roman" w:cs="Times New Roman"/>
+          <w:sz w:val="28"/>
+          <w:szCs w:val="28"/>
+        </w:rPr>
+        <w:t xml:space="preserve">  Thời gian tải trang nhanh.</w:t>
+      </w:r>
+    </w:p>
+    <w:p>
+      <w:pPr>
+        <w:spacing w:after="0" w:line="240" w:lineRule="auto"/>
+        <w:rPr>
+          <w:rFonts w:eastAsia="Times New Roman" w:cs="Times New Roman"/>
+          <w:sz w:val="28"/>
+          <w:szCs w:val="28"/>
+        </w:rPr>
+      </w:pPr>
+      <w:r>
+        <w:rPr>
+          <w:rFonts w:eastAsia="Times New Roman" w:hAnsi="Symbol" w:cs="Times New Roman"/>
+          <w:sz w:val="28"/>
+          <w:szCs w:val="28"/>
+        </w:rPr>
+        <w:t></w:t>
+      </w:r>
+      <w:r>
+        <w:rPr>
+          <w:rFonts w:eastAsia="Times New Roman" w:cs="Times New Roman"/>
+          <w:sz w:val="28"/>
+          <w:szCs w:val="28"/>
+        </w:rPr>
+        <w:t xml:space="preserve">  Hỗ trợ nhiều người dùng truy cập đồng thời.</w:t>
+      </w:r>
+    </w:p>
+    <w:p>
+      <w:pPr>
+        <w:rPr>
+          <w:rFonts w:eastAsia="Times New Roman" w:cs="Times New Roman"/>
+          <w:sz w:val="28"/>
+          <w:szCs w:val="28"/>
+        </w:rPr>
+      </w:pPr>
+      <w:r>
+        <w:rPr>
+          <w:rFonts w:eastAsia="Times New Roman" w:hAnsi="Symbol" w:cs="Times New Roman"/>
+          <w:sz w:val="28"/>
+          <w:szCs w:val="28"/>
+        </w:rPr>
+        <w:t></w:t>
+      </w:r>
+      <w:r>
+        <w:rPr>
+          <w:rFonts w:eastAsia="Times New Roman" w:cs="Times New Roman"/>
+          <w:sz w:val="28"/>
+          <w:szCs w:val="28"/>
+        </w:rPr>
+        <w:t xml:space="preserve">  Tối ưu truy vấn cơ sở dữ liệu.</w:t>
+      </w:r>
+    </w:p>
+    <w:p>
+      <w:pPr>
+        <w:spacing w:after="0" w:line="240" w:lineRule="auto"/>
+        <w:rPr>
+          <w:rFonts w:eastAsia="Times New Roman" w:cs="Times New Roman"/>
+          <w:sz w:val="28"/>
+          <w:szCs w:val="28"/>
+        </w:rPr>
+      </w:pPr>
+      <w:r>
+        <w:rPr>
+          <w:rFonts w:eastAsia="Times New Roman" w:hAnsi="Symbol" w:cs="Times New Roman"/>
+          <w:sz w:val="28"/>
+          <w:szCs w:val="28"/>
+        </w:rPr>
+        <w:t></w:t>
+      </w:r>
+      <w:r>
+        <w:rPr>
+          <w:rFonts w:eastAsia="Times New Roman" w:cs="Times New Roman"/>
+          <w:sz w:val="28"/>
+          <w:szCs w:val="28"/>
+        </w:rPr>
+        <w:t xml:space="preserve">  Mã hóa mật khẩu người dùng.</w:t>
+      </w:r>
+    </w:p>
+    <w:p>
+      <w:pPr>
+        <w:spacing w:after="0" w:line="240" w:lineRule="auto"/>
+        <w:rPr>
+          <w:rFonts w:eastAsia="Times New Roman" w:cs="Times New Roman"/>
+          <w:sz w:val="28"/>
+          <w:szCs w:val="28"/>
+        </w:rPr>
+      </w:pPr>
+      <w:r>
+        <w:rPr>
+          <w:rFonts w:eastAsia="Times New Roman" w:hAnsi="Symbol" w:cs="Times New Roman"/>
+          <w:sz w:val="28"/>
+          <w:szCs w:val="28"/>
+        </w:rPr>
+        <w:t></w:t>
+      </w:r>
+      <w:r>
+        <w:rPr>
+          <w:rFonts w:eastAsia="Times New Roman" w:cs="Times New Roman"/>
+          <w:sz w:val="28"/>
+          <w:szCs w:val="28"/>
+        </w:rPr>
+        <w:t xml:space="preserve">  Phân quyền quản trị.</w:t>
+      </w:r>
+    </w:p>
+    <w:p>
+      <w:pPr>
+        <w:spacing w:after="0" w:line="240" w:lineRule="auto"/>
+        <w:rPr>
+          <w:rFonts w:eastAsia="Times New Roman" w:cs="Times New Roman"/>
+          <w:sz w:val="28"/>
+          <w:szCs w:val="28"/>
+        </w:rPr>
+      </w:pPr>
+      <w:r>
+        <w:rPr>
+          <w:rFonts w:eastAsia="Times New Roman" w:hAnsi="Symbol" w:cs="Times New Roman"/>
+          <w:sz w:val="28"/>
+          <w:szCs w:val="28"/>
+        </w:rPr>
+        <w:t></w:t>
+      </w:r>
+      <w:r>
+        <w:rPr>
+          <w:rFonts w:eastAsia="Times New Roman" w:cs="Times New Roman"/>
+          <w:sz w:val="28"/>
+          <w:szCs w:val="28"/>
+        </w:rPr>
+        <w:t xml:space="preserve">  Bảo vệ dữ liệu khách hàng.</w:t>
+      </w:r>
+    </w:p>
+    <w:p>
+      <w:pPr>
+        <w:rPr>
+          <w:sz w:val="28"/>
+          <w:szCs w:val="28"/>
+        </w:rPr>
+      </w:pPr>
+      <w:r>
+        <w:rPr>
+          <w:rFonts w:eastAsia="Times New Roman" w:hAnsi="Symbol" w:cs="Times New Roman"/>
+          <w:sz w:val="28"/>
+          <w:szCs w:val="28"/>
+        </w:rPr>
+        <w:t></w:t>
+      </w:r>
+      <w:r>
+        <w:rPr>
+          <w:rFonts w:eastAsia="Times New Roman" w:cs="Times New Roman"/>
+          <w:sz w:val="28"/>
+          <w:szCs w:val="28"/>
+        </w:rPr>
+        <w:t xml:space="preserve">  Kiểm tra và xác thực dữ liệu đầu vào.</w:t>
+      </w:r>
     </w:p>
     <w:p>
       <w:pPr>
         <w:pStyle w:val="Heading4"/>
       </w:pPr>
-      <w:bookmarkStart w:id="10" w:name="_Toc230160107"/>
-      <w:r>
-        <w:t>Tiêu đề mục 2.2.2.1</w:t>
-      </w:r>
-      <w:bookmarkEnd w:id="10"/>
-    </w:p>
-    <w:p>
-      <w:pPr>
-        <w:pStyle w:val="Heading4"/>
-      </w:pPr>
-      <w:bookmarkStart w:id="11" w:name="_Toc230160108"/>
-      <w:r>
-        <w:t>Tiêu đề mục 2.2.2.2</w:t>
-      </w:r>
-      <w:bookmarkEnd w:id="11"/>
-    </w:p>
-    <w:p>
-      <w:r>
-        <w:br w:type="page"/>
-      </w:r>
-    </w:p>
-    <w:p>
-      <w:pPr>
-        <w:pStyle w:val="Heading1"/>
-      </w:pPr>
-      <w:bookmarkStart w:id="12" w:name="_Toc230160109"/>
-      <w:r>
-        <w:t>Phân tích thiết kế hệ thống</w:t>
-      </w:r>
-      <w:bookmarkEnd w:id="12"/>
-    </w:p>
-    <w:p>
-      <w:pPr>
-        <w:pStyle w:val="Heading2"/>
-      </w:pPr>
-      <w:bookmarkStart w:id="13" w:name="_Toc230160110"/>
-      <w:r>
-        <w:t>Mô tả vấn đề</w:t>
-      </w:r>
-      <w:bookmarkEnd w:id="13"/>
-    </w:p>
-    <w:p>
-      <w:pPr>
-        <w:pStyle w:val="isselectedend"/>
-        <w:rPr>
-          <w:sz w:val="28"/>
-          <w:szCs w:val="28"/>
-        </w:rPr>
-      </w:pPr>
-      <w:r>
-        <w:rPr>
-          <w:sz w:val="28"/>
-          <w:szCs w:val="28"/>
-        </w:rPr>
-        <w:t>Hiện nay nhu cầu tìm kiếm và mua sách lịch sử Việt Nam ngày càng tăng. Tuy nhiên, việc tiếp cận các đầu sách lịch sử còn gặp nhiều khó khăn do nguồn sách phân tán, thiếu thông tin và chưa có hệ thống chuyên biệt hỗ trợ người đọc.</w:t>
-      </w:r>
-    </w:p>
-    <w:p>
-      <w:pPr>
-        <w:pStyle w:val="NormalWeb"/>
-        <w:rPr>
-          <w:sz w:val="28"/>
-          <w:szCs w:val="28"/>
-        </w:rPr>
-      </w:pPr>
-      <w:r>
-        <w:rPr>
-          <w:sz w:val="28"/>
-          <w:szCs w:val="28"/>
-        </w:rPr>
-        <w:t>Website mua bán sách lịch sử Việt Nam được xây dựng nhằm cung cấp nền tảng trực tuyến cho phép người dùng tìm kiếm, xem thông tin chi tiết, đặt mua sách và quản lý đơn hàng một cách thuận tiện</w:t>
-      </w:r>
-      <w:r>
-        <w:rPr>
-          <w:sz w:val="28"/>
-          <w:szCs w:val="28"/>
-        </w:rPr>
-        <w:t>.</w:t>
-      </w:r>
-    </w:p>
-    <w:p>
-      <w:pPr>
-        <w:pStyle w:val="Heading2"/>
-      </w:pPr>
-      <w:bookmarkStart w:id="14" w:name="_Toc230160111"/>
-      <w:r>
-        <w:t>Đặc tả yêu cầu hệ thống</w:t>
-      </w:r>
-      <w:bookmarkEnd w:id="14"/>
-    </w:p>
-    <w:p>
-      <w:pPr>
-        <w:pStyle w:val="Heading3"/>
-      </w:pPr>
-      <w:bookmarkStart w:id="15" w:name="_Toc230160112"/>
-      <w:r>
-        <w:t>Yêu cầu chức năng</w:t>
-      </w:r>
-      <w:bookmarkEnd w:id="15"/>
-    </w:p>
-    <w:p>
-      <w:pPr>
-        <w:spacing w:after="0" w:line="240" w:lineRule="auto"/>
-        <w:rPr>
-          <w:rFonts w:eastAsia="Times New Roman" w:cs="Times New Roman"/>
-          <w:sz w:val="28"/>
-          <w:szCs w:val="28"/>
-        </w:rPr>
-      </w:pPr>
-      <w:r>
-        <w:rPr>
-          <w:rFonts w:eastAsia="Times New Roman" w:hAnsi="Symbol" w:cs="Times New Roman"/>
-          <w:sz w:val="28"/>
-          <w:szCs w:val="28"/>
-        </w:rPr>
-        <w:t></w:t>
-      </w:r>
-      <w:r>
-        <w:rPr>
-          <w:rFonts w:eastAsia="Times New Roman" w:cs="Times New Roman"/>
-          <w:sz w:val="28"/>
-          <w:szCs w:val="28"/>
-        </w:rPr>
-        <w:t xml:space="preserve">  Đăng ký tài khoản.</w:t>
-      </w:r>
-    </w:p>
-    <w:p>
-      <w:pPr>
-        <w:spacing w:after="0" w:line="240" w:lineRule="auto"/>
-        <w:rPr>
-          <w:rFonts w:eastAsia="Times New Roman" w:cs="Times New Roman"/>
-          <w:sz w:val="28"/>
-          <w:szCs w:val="28"/>
-        </w:rPr>
-      </w:pPr>
-      <w:r>
-        <w:rPr>
-          <w:rFonts w:eastAsia="Times New Roman" w:hAnsi="Symbol" w:cs="Times New Roman"/>
-          <w:sz w:val="28"/>
-          <w:szCs w:val="28"/>
-        </w:rPr>
-        <w:t></w:t>
-      </w:r>
-      <w:r>
-        <w:rPr>
-          <w:rFonts w:eastAsia="Times New Roman" w:cs="Times New Roman"/>
-          <w:sz w:val="28"/>
-          <w:szCs w:val="28"/>
-        </w:rPr>
-        <w:t xml:space="preserve">  Đăng nhập và đăng xuất.</w:t>
-      </w:r>
-    </w:p>
-    <w:p>
-      <w:pPr>
-        <w:spacing w:after="0" w:line="240" w:lineRule="auto"/>
-        <w:rPr>
-          <w:rFonts w:eastAsia="Times New Roman" w:cs="Times New Roman"/>
-          <w:sz w:val="28"/>
-          <w:szCs w:val="28"/>
-        </w:rPr>
-      </w:pPr>
-      <w:r>
-        <w:rPr>
-          <w:rFonts w:eastAsia="Times New Roman" w:hAnsi="Symbol" w:cs="Times New Roman"/>
-          <w:sz w:val="28"/>
-          <w:szCs w:val="28"/>
-        </w:rPr>
-        <w:t></w:t>
-      </w:r>
-      <w:r>
-        <w:rPr>
-          <w:rFonts w:eastAsia="Times New Roman" w:cs="Times New Roman"/>
-          <w:sz w:val="28"/>
-          <w:szCs w:val="28"/>
-        </w:rPr>
-        <w:t xml:space="preserve">  Xem danh mục sách lịch sử.</w:t>
-      </w:r>
-    </w:p>
-    <w:p>
-      <w:pPr>
-        <w:spacing w:after="0" w:line="240" w:lineRule="auto"/>
-        <w:rPr>
-          <w:rFonts w:eastAsia="Times New Roman" w:cs="Times New Roman"/>
-          <w:sz w:val="28"/>
-          <w:szCs w:val="28"/>
-        </w:rPr>
-      </w:pPr>
-      <w:r>
-        <w:rPr>
-          <w:rFonts w:eastAsia="Times New Roman" w:hAnsi="Symbol" w:cs="Times New Roman"/>
-          <w:sz w:val="28"/>
-          <w:szCs w:val="28"/>
-        </w:rPr>
-        <w:t></w:t>
-      </w:r>
-      <w:r>
-        <w:rPr>
-          <w:rFonts w:eastAsia="Times New Roman" w:cs="Times New Roman"/>
-          <w:sz w:val="28"/>
-          <w:szCs w:val="28"/>
-        </w:rPr>
-        <w:t xml:space="preserve">  Tìm kiếm sách theo tên hoặc tác giả.</w:t>
-      </w:r>
-    </w:p>
-    <w:p>
-      <w:pPr>
-        <w:spacing w:after="0" w:line="240" w:lineRule="auto"/>
-        <w:rPr>
-          <w:rFonts w:eastAsia="Times New Roman" w:cs="Times New Roman"/>
-          <w:sz w:val="28"/>
-          <w:szCs w:val="28"/>
-        </w:rPr>
-      </w:pPr>
-      <w:r>
-        <w:rPr>
-          <w:rFonts w:eastAsia="Times New Roman" w:hAnsi="Symbol" w:cs="Times New Roman"/>
-          <w:sz w:val="28"/>
-          <w:szCs w:val="28"/>
-        </w:rPr>
-        <w:t></w:t>
-      </w:r>
-      <w:r>
-        <w:rPr>
-          <w:rFonts w:eastAsia="Times New Roman" w:cs="Times New Roman"/>
-          <w:sz w:val="28"/>
-          <w:szCs w:val="28"/>
-        </w:rPr>
-        <w:t xml:space="preserve">  Xem thông tin chi tiết sách.</w:t>
-      </w:r>
-    </w:p>
-    <w:p>
-      <w:pPr>
-        <w:spacing w:after="0" w:line="240" w:lineRule="auto"/>
-        <w:rPr>
-          <w:rFonts w:eastAsia="Times New Roman" w:cs="Times New Roman"/>
-          <w:sz w:val="28"/>
-          <w:szCs w:val="28"/>
-        </w:rPr>
-      </w:pPr>
-      <w:r>
-        <w:rPr>
-          <w:rFonts w:eastAsia="Times New Roman" w:hAnsi="Symbol" w:cs="Times New Roman"/>
-          <w:sz w:val="28"/>
-          <w:szCs w:val="28"/>
-        </w:rPr>
-        <w:t></w:t>
-      </w:r>
-      <w:r>
-        <w:rPr>
-          <w:rFonts w:eastAsia="Times New Roman" w:cs="Times New Roman"/>
-          <w:sz w:val="28"/>
-          <w:szCs w:val="28"/>
-        </w:rPr>
-        <w:t xml:space="preserve">  Thêm sách vào giỏ hàng.</w:t>
-      </w:r>
-    </w:p>
-    <w:p>
-      <w:pPr>
-        <w:spacing w:after="0" w:line="240" w:lineRule="auto"/>
-        <w:rPr>
-          <w:rFonts w:eastAsia="Times New Roman" w:cs="Times New Roman"/>
-          <w:sz w:val="28"/>
-          <w:szCs w:val="28"/>
-        </w:rPr>
-      </w:pPr>
-      <w:r>
-        <w:rPr>
-          <w:rFonts w:eastAsia="Times New Roman" w:hAnsi="Symbol" w:cs="Times New Roman"/>
-          <w:sz w:val="28"/>
-          <w:szCs w:val="28"/>
-        </w:rPr>
-        <w:t></w:t>
-      </w:r>
-      <w:r>
-        <w:rPr>
-          <w:rFonts w:eastAsia="Times New Roman" w:cs="Times New Roman"/>
-          <w:sz w:val="28"/>
-          <w:szCs w:val="28"/>
-        </w:rPr>
-        <w:t xml:space="preserve">  Đặt hàng trực tuyến.</w:t>
-      </w:r>
-    </w:p>
-    <w:p>
-      <w:pPr>
-        <w:spacing w:after="0" w:line="240" w:lineRule="auto"/>
-        <w:rPr>
-          <w:rFonts w:eastAsia="Times New Roman" w:cs="Times New Roman"/>
-          <w:sz w:val="28"/>
-          <w:szCs w:val="28"/>
-        </w:rPr>
-      </w:pPr>
-      <w:r>
-        <w:rPr>
-          <w:rFonts w:eastAsia="Times New Roman" w:hAnsi="Symbol" w:cs="Times New Roman"/>
-          <w:sz w:val="28"/>
-          <w:szCs w:val="28"/>
-        </w:rPr>
-        <w:t></w:t>
-      </w:r>
-      <w:r>
-        <w:rPr>
-          <w:rFonts w:eastAsia="Times New Roman" w:cs="Times New Roman"/>
-          <w:sz w:val="28"/>
-          <w:szCs w:val="28"/>
-        </w:rPr>
-        <w:t xml:space="preserve">  Quản lý đơn hàng.</w:t>
-      </w:r>
-    </w:p>
-    <w:p>
-      <w:pPr>
-        <w:spacing w:after="0" w:line="240" w:lineRule="auto"/>
-        <w:rPr>
-          <w:rFonts w:eastAsia="Times New Roman" w:cs="Times New Roman"/>
-          <w:sz w:val="28"/>
-          <w:szCs w:val="28"/>
-        </w:rPr>
-      </w:pPr>
-      <w:r>
-        <w:rPr>
-          <w:rFonts w:eastAsia="Times New Roman" w:hAnsi="Symbol" w:cs="Times New Roman"/>
-          <w:sz w:val="28"/>
-          <w:szCs w:val="28"/>
-        </w:rPr>
-        <w:t></w:t>
-      </w:r>
-      <w:r>
-        <w:rPr>
-          <w:rFonts w:eastAsia="Times New Roman" w:cs="Times New Roman"/>
-          <w:sz w:val="28"/>
-          <w:szCs w:val="28"/>
-        </w:rPr>
-        <w:t xml:space="preserve">  Quản lý thông tin cá nhân.</w:t>
-      </w:r>
-    </w:p>
-    <w:p>
-      <w:pPr>
-        <w:rPr>
-          <w:sz w:val="28"/>
-          <w:szCs w:val="28"/>
-        </w:rPr>
-      </w:pPr>
-      <w:r>
-        <w:rPr>
-          <w:rFonts w:eastAsia="Times New Roman" w:hAnsi="Symbol" w:cs="Times New Roman"/>
-          <w:sz w:val="28"/>
-          <w:szCs w:val="28"/>
-        </w:rPr>
-        <w:t></w:t>
-      </w:r>
-      <w:r>
-        <w:rPr>
-          <w:rFonts w:eastAsia="Times New Roman" w:cs="Times New Roman"/>
-          <w:sz w:val="28"/>
-          <w:szCs w:val="28"/>
-        </w:rPr>
-        <w:t xml:space="preserve">  Quản trị sách và người dùng.</w:t>
-      </w:r>
-    </w:p>
-    <w:p>
-      <w:pPr>
-        <w:pStyle w:val="Heading3"/>
-      </w:pPr>
-      <w:bookmarkStart w:id="16" w:name="_Toc230160113"/>
-      <w:r>
-        <w:t>Yêu cầu phi chức năng</w:t>
-      </w:r>
-      <w:bookmarkEnd w:id="16"/>
-    </w:p>
-    <w:p>
-      <w:pPr>
-        <w:spacing w:after="0" w:line="240" w:lineRule="auto"/>
-        <w:rPr>
-          <w:rFonts w:eastAsia="Times New Roman" w:cs="Times New Roman"/>
-          <w:sz w:val="28"/>
-          <w:szCs w:val="28"/>
-        </w:rPr>
-      </w:pPr>
-      <w:r>
-        <w:rPr>
-          <w:rFonts w:eastAsia="Times New Roman" w:hAnsi="Symbol" w:cs="Times New Roman"/>
-          <w:sz w:val="28"/>
-          <w:szCs w:val="28"/>
-        </w:rPr>
-        <w:t></w:t>
-      </w:r>
-      <w:r>
-        <w:rPr>
-          <w:rFonts w:eastAsia="Times New Roman" w:cs="Times New Roman"/>
-          <w:sz w:val="28"/>
-          <w:szCs w:val="28"/>
-        </w:rPr>
-        <w:t xml:space="preserve">  Thời gian tải trang nhanh.</w:t>
-      </w:r>
-    </w:p>
-    <w:p>
-      <w:pPr>
-        <w:spacing w:after="0" w:line="240" w:lineRule="auto"/>
-        <w:rPr>
-          <w:rFonts w:eastAsia="Times New Roman" w:cs="Times New Roman"/>
-          <w:sz w:val="28"/>
-          <w:szCs w:val="28"/>
-        </w:rPr>
-      </w:pPr>
-      <w:r>
-        <w:rPr>
-          <w:rFonts w:eastAsia="Times New Roman" w:hAnsi="Symbol" w:cs="Times New Roman"/>
-          <w:sz w:val="28"/>
-          <w:szCs w:val="28"/>
-        </w:rPr>
-        <w:t></w:t>
-      </w:r>
-      <w:r>
-        <w:rPr>
-          <w:rFonts w:eastAsia="Times New Roman" w:cs="Times New Roman"/>
-          <w:sz w:val="28"/>
-          <w:szCs w:val="28"/>
-        </w:rPr>
-        <w:t xml:space="preserve">  Hỗ trợ nhiều người dùng truy cập đồng thời.</w:t>
-      </w:r>
-    </w:p>
-    <w:p>
-      <w:pPr>
-        <w:rPr>
-          <w:rFonts w:eastAsia="Times New Roman" w:cs="Times New Roman"/>
-          <w:sz w:val="28"/>
-          <w:szCs w:val="28"/>
-        </w:rPr>
-      </w:pPr>
-      <w:r>
-        <w:rPr>
-          <w:rFonts w:eastAsia="Times New Roman" w:hAnsi="Symbol" w:cs="Times New Roman"/>
-          <w:sz w:val="28"/>
-          <w:szCs w:val="28"/>
-        </w:rPr>
-        <w:t></w:t>
-      </w:r>
-      <w:r>
-        <w:rPr>
-          <w:rFonts w:eastAsia="Times New Roman" w:cs="Times New Roman"/>
-          <w:sz w:val="28"/>
-          <w:szCs w:val="28"/>
-        </w:rPr>
-        <w:t xml:space="preserve">  Tối ưu truy vấn cơ sở dữ liệu.</w:t>
-      </w:r>
-    </w:p>
-    <w:p>
-      <w:pPr>
-        <w:spacing w:after="0" w:line="240" w:lineRule="auto"/>
-        <w:rPr>
-          <w:rFonts w:eastAsia="Times New Roman" w:cs="Times New Roman"/>
-          <w:sz w:val="28"/>
-          <w:szCs w:val="28"/>
-        </w:rPr>
-      </w:pPr>
-      <w:r>
-        <w:rPr>
-          <w:rFonts w:eastAsia="Times New Roman" w:hAnsi="Symbol" w:cs="Times New Roman"/>
-          <w:sz w:val="28"/>
-          <w:szCs w:val="28"/>
-        </w:rPr>
-        <w:t></w:t>
-      </w:r>
-      <w:r>
-        <w:rPr>
-          <w:rFonts w:eastAsia="Times New Roman" w:cs="Times New Roman"/>
-          <w:sz w:val="28"/>
-          <w:szCs w:val="28"/>
-        </w:rPr>
-        <w:t xml:space="preserve">  Mã hóa mật khẩu người dùng.</w:t>
-      </w:r>
-    </w:p>
-    <w:p>
-      <w:pPr>
-        <w:spacing w:after="0" w:line="240" w:lineRule="auto"/>
-        <w:rPr>
-          <w:rFonts w:eastAsia="Times New Roman" w:cs="Times New Roman"/>
-          <w:sz w:val="28"/>
-          <w:szCs w:val="28"/>
-        </w:rPr>
-      </w:pPr>
-      <w:r>
-        <w:rPr>
-          <w:rFonts w:eastAsia="Times New Roman" w:hAnsi="Symbol" w:cs="Times New Roman"/>
-          <w:sz w:val="28"/>
-          <w:szCs w:val="28"/>
-        </w:rPr>
-        <w:t></w:t>
-      </w:r>
-      <w:r>
-        <w:rPr>
-          <w:rFonts w:eastAsia="Times New Roman" w:cs="Times New Roman"/>
-          <w:sz w:val="28"/>
-          <w:szCs w:val="28"/>
-        </w:rPr>
-        <w:t xml:space="preserve">  Phân quyền quản trị.</w:t>
-      </w:r>
-    </w:p>
-    <w:p>
-      <w:pPr>
-        <w:spacing w:after="0" w:line="240" w:lineRule="auto"/>
-        <w:rPr>
-          <w:rFonts w:eastAsia="Times New Roman" w:cs="Times New Roman"/>
-          <w:sz w:val="28"/>
-          <w:szCs w:val="28"/>
-        </w:rPr>
-      </w:pPr>
-      <w:r>
-        <w:rPr>
-          <w:rFonts w:eastAsia="Times New Roman" w:hAnsi="Symbol" w:cs="Times New Roman"/>
-          <w:sz w:val="28"/>
-          <w:szCs w:val="28"/>
-        </w:rPr>
-        <w:t></w:t>
-      </w:r>
-      <w:r>
-        <w:rPr>
-          <w:rFonts w:eastAsia="Times New Roman" w:cs="Times New Roman"/>
-          <w:sz w:val="28"/>
-          <w:szCs w:val="28"/>
-        </w:rPr>
-        <w:t xml:space="preserve">  Bảo vệ dữ liệu khách hàng.</w:t>
-      </w:r>
-    </w:p>
-    <w:p>
-      <w:pPr>
-        <w:rPr>
-          <w:sz w:val="28"/>
-          <w:szCs w:val="28"/>
-        </w:rPr>
-      </w:pPr>
-      <w:r>
-        <w:rPr>
-          <w:rFonts w:eastAsia="Times New Roman" w:hAnsi="Symbol" w:cs="Times New Roman"/>
-          <w:sz w:val="28"/>
-          <w:szCs w:val="28"/>
-        </w:rPr>
-        <w:t></w:t>
-      </w:r>
-      <w:r>
-        <w:rPr>
-          <w:rFonts w:eastAsia="Times New Roman" w:cs="Times New Roman"/>
-          <w:sz w:val="28"/>
-          <w:szCs w:val="28"/>
-        </w:rPr>
-        <w:t xml:space="preserve">  Kiểm tra và xác thực dữ liệu đầu vào.</w:t>
-      </w:r>
-    </w:p>
-    <w:p>
-      <w:pPr>
-        <w:pStyle w:val="Heading4"/>
-      </w:pPr>
       <w:bookmarkStart w:id="17" w:name="_Toc230160114"/>
       <w:r>
-        <w:lastRenderedPageBreak/>
         <w:t>Tiêu đề mục 2.2.2.1</w:t>
       </w:r>
       <w:bookmarkEnd w:id="17"/>
@@ -2622,6 +2614,7 @@
         <w:keepNext/>
       </w:pPr>
       <w:r>
+        <w:lastRenderedPageBreak/>
         <w:t xml:space="preserve">Bảng </w:t>
       </w:r>
       <w:r>
@@ -3274,7 +3267,6 @@
           </w:tcPr>
           <w:p>
             <w:r>
-              <w:lastRenderedPageBreak/>
               <w:t>4</w:t>
             </w:r>
           </w:p>
@@ -3479,6 +3471,7 @@
           </w:tcPr>
           <w:p>
             <w:r>
+              <w:lastRenderedPageBreak/>
               <w:t>6</w:t>
             </w:r>
           </w:p>
@@ -3688,7 +3681,6 @@
           </w:tcPr>
           <w:p>
             <w:r>
-              <w:lastRenderedPageBreak/>
               <w:t>8</w:t>
             </w:r>
           </w:p>
@@ -3906,6 +3898,7 @@
               <w:jc w:val="left"/>
             </w:pPr>
             <w:r>
+              <w:lastRenderedPageBreak/>
               <w:t xml:space="preserve">         10</w:t>
             </w:r>
           </w:p>
@@ -4113,7 +4106,6 @@
           </w:tcPr>
           <w:p>
             <w:r>
-              <w:lastRenderedPageBreak/>
               <w:t>12</w:t>
             </w:r>
           </w:p>
@@ -4425,6 +4417,7 @@
           </w:tcPr>
           <w:p>
             <w:r>
+              <w:lastRenderedPageBreak/>
               <w:t>15</w:t>
             </w:r>
           </w:p>
@@ -4532,7 +4525,6 @@
           </w:tcPr>
           <w:p>
             <w:r>
-              <w:lastRenderedPageBreak/>
               <w:t>16</w:t>
             </w:r>
           </w:p>
@@ -4878,7 +4870,15 @@
           <w:sz w:val="28"/>
           <w:szCs w:val="28"/>
         </w:rPr>
-        <w:t>Hệ thống Website Mua Bán Sách Lịch Sử Việt Nam được thiết kế với các chức năng chính nhằm đáp ứng nhu cầu tìm kiếm, lựa chọn và mua sách trực tuyến của người dùng. Các chức năng được phân chia thành hai nhóm chính: chức năng dành cho khách hàng và chức năng dành cho quản trị viên.</w:t>
+        <w:t xml:space="preserve">Hệ thống Website Mua Bán Sách Lịch Sử Việt Nam được thiết kế với các chức năng chính nhằm đáp ứng nhu cầu tìm kiếm, lựa chọn và mua sách trực </w:t>
+      </w:r>
+      <w:r>
+        <w:rPr>
+          <w:sz w:val="28"/>
+          <w:szCs w:val="28"/>
+        </w:rPr>
+        <w:lastRenderedPageBreak/>
+        <w:t>tuyến của người dùng. Các chức năng được phân chia thành hai nhóm chính: chức năng dành cho khách hàng và chức năng dành cho quản trị viên.</w:t>
       </w:r>
     </w:p>
     <w:p>
@@ -5038,7 +5038,6 @@
           <w:sz w:val="28"/>
           <w:szCs w:val="28"/>
         </w:rPr>
-        <w:lastRenderedPageBreak/>
         <w:t>Đặt hàng trực tuyến.</w:t>
       </w:r>
     </w:p>

</xml_diff>